<commit_message>
backup: tự động 29/09/2026 21:00 (5 tệp)
</commit_message>
<xml_diff>
--- a/30-Ket-Qua/2026-09-24/Track-Changes/QD-1899-CDKT_sua-theo-quy-mo-24894-trieu_20260924.docx
+++ b/30-Ket-Qua/2026-09-24/Track-Changes/QD-1899-CDKT_sua-theo-quy-mo-24894-trieu_20260924.docx
@@ -147,7 +147,7 @@
                 </mc:Choice>
                 <mc:Fallback>
                   <w:pict>
-                    <v:line w14:anchorId="675EC0C6" id="Straight Connector 1" o:spid="_x0000_s1026" style="position:absolute;z-index:251660288;visibility:visible;mso-wrap-style:square;mso-wrap-distance-left:9pt;mso-wrap-distance-top:0;mso-wrap-distance-right:9pt;mso-wrap-distance-bottom:0;mso-position-horizontal:absolute;mso-position-horizontal-relative:text;mso-position-vertical:absolute;mso-position-vertical-relative:text" from="75.65pt,16.5pt" to="141.05pt,16.5pt" o:gfxdata="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" strokecolor="black [3213]" strokeweight="1pt"/>
+                    <v:line w14:anchorId="7E11A1FC" id="Straight Connector 1" o:spid="_x0000_s1026" style="position:absolute;z-index:251660288;visibility:visible;mso-wrap-style:square;mso-wrap-distance-left:9pt;mso-wrap-distance-top:0;mso-wrap-distance-right:9pt;mso-wrap-distance-bottom:0;mso-position-horizontal:absolute;mso-position-horizontal-relative:text;mso-position-vertical:absolute;mso-position-vertical-relative:text" from="75.65pt,16.5pt" to="141.05pt,16.5pt" o:gfxdata="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" strokecolor="black [3213]" strokeweight="1pt"/>
                   </w:pict>
                 </mc:Fallback>
               </mc:AlternateContent>
@@ -301,7 +301,7 @@
                 </mc:Choice>
                 <mc:Fallback>
                   <w:pict>
-                    <v:line w14:anchorId="323201C5" id="Straight Connector 4" o:spid="_x0000_s1026" style="position:absolute;z-index:251659264;visibility:visible;mso-wrap-style:square;mso-wrap-distance-left:9pt;mso-wrap-distance-top:0;mso-wrap-distance-right:9pt;mso-wrap-distance-bottom:0;mso-position-horizontal:absolute;mso-position-horizontal-relative:text;mso-position-vertical:absolute;mso-position-vertical-relative:text" from="64.1pt,17.45pt" to="234.9pt,17.45pt" o:gfxdata="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" strokecolor="black [3040]"/>
+                    <v:line w14:anchorId="0B483B4D" id="Straight Connector 4" o:spid="_x0000_s1026" style="position:absolute;z-index:251659264;visibility:visible;mso-wrap-style:square;mso-wrap-distance-left:9pt;mso-wrap-distance-top:0;mso-wrap-distance-right:9pt;mso-wrap-distance-bottom:0;mso-position-horizontal:absolute;mso-position-horizontal-relative:text;mso-position-vertical:absolute;mso-position-vertical-relative:text" from="64.1pt,17.45pt" to="234.9pt,17.45pt" o:gfxdata="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" strokecolor="black [3040]"/>
                   </w:pict>
                 </mc:Fallback>
               </mc:AlternateContent>
@@ -348,7 +348,15 @@
                 <w:szCs w:val="26"/>
                 <w:lang w:val="en-US"/>
               </w:rPr>
-              <w:t xml:space="preserve"> 1899</w:t>
+              <w:t xml:space="preserve"> </w:t>
+            </w:r>
+            <w:r>
+              <w:rPr>
+                <w:sz w:val="26"/>
+                <w:szCs w:val="26"/>
+                <w:lang w:val="en-US"/>
+              </w:rPr>
+              <w:t xml:space="preserve">       </w:t>
             </w:r>
             <w:r>
               <w:rPr>
@@ -412,7 +420,23 @@
                 <w:sz w:val="28"/>
                 <w:lang w:val="en-US"/>
               </w:rPr>
-              <w:t xml:space="preserve"> 28 </w:t>
+              <w:t xml:space="preserve"> </w:t>
+            </w:r>
+            <w:r>
+              <w:rPr>
+                <w:i/>
+                <w:sz w:val="28"/>
+                <w:lang w:val="en-US"/>
+              </w:rPr>
+              <w:t>29</w:t>
+            </w:r>
+            <w:r>
+              <w:rPr>
+                <w:i/>
+                <w:sz w:val="28"/>
+                <w:lang w:val="en-US"/>
+              </w:rPr>
+              <w:t xml:space="preserve"> </w:t>
             </w:r>
             <w:r>
               <w:rPr>
@@ -427,7 +451,7 @@
                 <w:sz w:val="28"/>
                 <w:lang w:val="en-US"/>
               </w:rPr>
-              <w:t>8</w:t>
+              <w:t>9</w:t>
             </w:r>
             <w:r>
               <w:rPr>
@@ -498,26 +522,8 @@
           <w:b/>
           <w:color w:val="000000"/>
         </w:rPr>
-        <w:t xml:space="preserve">“Đầu tư, cải tạo các công trình phục vụ người học, nhà giáo và mua sắm bổ sung thiết bị đáp ứng mục tiêu xây dựng Trường Cao đẳng Kon Tum trở thành trường cao đẳng </w:t>
+        <w:t>“Đầu tư, cải tạo các công trình phục vụ người học, nhà giáo và mua sắm bổ sung thiết bị đáp ứng mục tiêu xây dựng Trường Cao đẳng Kon Tum trở thành trường cao đẳng chất lượng cao giai đoạn 2026 - 2030”</w:t>
       </w:r>
-      <w:del w:id="1001" w:author="Điều chỉnh quy mô 24.894 triệu (Claude)" w:date="2026-09-24T14:40:25Z">
-        <w:r>
-          <w:rPr>
-            <w:b/>
-            <w:color w:val="000000"/>
-          </w:rPr>
-          <w:delText xml:space="preserve">chất lượng cao giai đoạn 2026-2030”</w:delText>
-        </w:r>
-      </w:del>
-      <w:ins w:id="1002" w:author="Điều chỉnh quy mô 24.894 triệu (Claude)" w:date="2026-09-24T14:40:25Z">
-        <w:r>
-          <w:rPr>
-            <w:b/>
-            <w:color w:val="000000"/>
-          </w:rPr>
-          <w:t xml:space="preserve">chất lượng cao giai đoạn 2026 - 2030”</w:t>
-        </w:r>
-      </w:ins>
     </w:p>
     <w:p>
       <w:pPr>
@@ -560,32 +566,7 @@
           <w:i/>
           <w:color w:val="000000"/>
         </w:rPr>
-        <w:t xml:space="preserve">Căn cứ </w:t>
-      </w:r>
-      <w:del w:id="1067" w:author="Viện dẫn theo quy tắc hiện hành (Claude)" w:date="2026-09-24T14:40:25Z">
-        <w:r>
-          <w:rPr>
-            <w:i/>
-            <w:color w:val="000000"/>
-          </w:rPr>
-          <w:delText xml:space="preserve">Quyết định số 988/QĐ-CĐKT ngày 12/5/2026</w:delText>
-        </w:r>
-      </w:del>
-      <w:ins w:id="1068" w:author="Viện dẫn theo quy tắc hiện hành (Claude)" w:date="2026-09-24T14:40:25Z">
-        <w:r>
-          <w:rPr>
-            <w:i/>
-            <w:color w:val="000000"/>
-          </w:rPr>
-          <w:t xml:space="preserve">Quyết định số 1976/QĐ-CĐKT ngày 14/9/2026</w:t>
-        </w:r>
-      </w:ins>
-      <w:r>
-        <w:rPr>
-          <w:i/>
-          <w:color w:val="000000"/>
-        </w:rPr>
-        <w:t xml:space="preserve"> của Hiệu trưởng Trường Cao đẳng Kon Tum ban hành Quy chế tổ chức và hoạt động của Trường Cao đẳng Kon Tum;</w:t>
+        <w:t>Căn cứ Quyết định số 1976/QĐ-CĐKT ngày 14/9/2026 của Hiệu trưởng Trường Cao đẳng Kon Tum ban hành Quy chế tổ chức và hoạt động của Trường Cao đẳng Kon Tum;</w:t>
       </w:r>
     </w:p>
     <w:p>
@@ -598,23 +579,7 @@
           <w:i/>
           <w:color w:val="000000"/>
         </w:rPr>
-        <w:t xml:space="preserve">Căn cứ Luật Đầu tư công ngày 29/11/2024</w:t>
-      </w:r>
-      <w:del w:id="1069" w:author="Viện dẫn theo quy tắc hiện hành (Claude)" w:date="2026-09-24T14:40:25Z">
-        <w:r>
-          <w:rPr>
-            <w:i/>
-            <w:color w:val="000000"/>
-          </w:rPr>
-          <w:delText xml:space="preserve"> đã được sửa đổi, bổ sung theo Luật số 90/2025/QH15 ngày 25/6/2025</w:delText>
-        </w:r>
-      </w:del>
-      <w:r>
-        <w:rPr>
-          <w:i/>
-          <w:color w:val="000000"/>
-        </w:rPr>
-        <w:t xml:space="preserve">;</w:t>
+        <w:t>Căn cứ Luật Đầu tư công ngày 29/11/2024;</w:t>
       </w:r>
     </w:p>
     <w:p>
@@ -695,15 +660,13 @@
           <w:color w:val="000000"/>
         </w:rPr>
       </w:pPr>
-      <w:ins w:id="1009" w:author="Bổ sung căn cứ (Claude)" w:date="2026-09-24T14:40:25Z">
-        <w:r>
-          <w:rPr>
-            <w:i/>
-            <w:color w:val="000000"/>
-          </w:rPr>
-          <w:t xml:space="preserve">Căn cứ Nghị quyết số 56/NQ-HĐND ngày 28/8/2026 của Hội đồng nhân dân tỉnh Quảng Ngãi về việc phân bổ kế hoạch đầu tư công và kinh phí thường xuyên năm 2026 thực hiện Chương trình mục tiêu quốc gia xây dựng nông thôn mới, giảm nghèo bền vững và phát triển kinh tế - xã hội vùng đồng bào dân tộc thiểu số và miền núi giai đoạn 2026 - 2035, giai đoạn I: Từ năm 2026 đến năm 2030 trên địa bàn tỉnh Quảng Ngãi;</w:t>
-        </w:r>
-      </w:ins>
+      <w:r>
+        <w:rPr>
+          <w:i/>
+          <w:color w:val="000000"/>
+        </w:rPr>
+        <w:t>Căn cứ Nghị quyết số 56/NQ-HĐND ngày 28/8/2026 của Hội đồng nhân dân tỉnh Quảng Ngãi về việc phân bổ kế hoạch đầu tư công và kinh phí thường xuyên năm 2026 thực hiện Chương trình mục tiêu quốc gia xây dựng nông thôn mới, giảm nghèo bền vững và phát triển kinh tế - xã hội vùng đồng bào dân tộc thiểu số và miền núi giai đoạn 2026 - 2035, giai đoạn I: Từ năm 2026 đến năm 2030 trên địa bàn tỉnh Quảng Ngãi;</w:t>
+      </w:r>
     </w:p>
     <w:p>
       <w:pPr>
@@ -715,14 +678,28 @@
           <w:i/>
           <w:color w:val="000000"/>
         </w:rPr>
-        <w:t xml:space="preserve">Căn cứ Thông báo số 916/TB-UBND ngày 27/8/2026 của UBND tỉnh Quảng Ngãi </w:t>
+        <w:t xml:space="preserve">Căn cứ </w:t>
       </w:r>
       <w:r>
         <w:rPr>
           <w:i/>
           <w:color w:val="000000"/>
         </w:rPr>
-        <w:t>kết luận của Phó Chủ tịch Thường trực UBND tỉnh Y Ngọc tại buổi làm việc với Trường Cao đẳng Kon Tum về tình hình hoạt động, công tác sắp xếp tài sản công của Trường trong thời gian qua và nhiệm vụ trọng tâm trong thời gian đến;</w:t>
+        <w:t xml:space="preserve">Quyết định số 805/QĐ-UBND ngày 11/9/2026 của Ủy ban nhân dân tỉnh Quảng Ngãi </w:t>
+      </w:r>
+      <w:r>
+        <w:rPr>
+          <w:i/>
+          <w:color w:val="000000"/>
+        </w:rPr>
+        <w:t>phân bổ kế hoạch vốn đầu tư công và kinh phí thường xuyên năm 2026 thực hiện Chương trình mục tiêu quốc gia xây dựng nông thôn mới, giảm nghèo bền vững và phát triển kinh tế - xã hội vùng đồng bào dân tộc thiểu số và miền núi giai đoạn 2026 - 2035, giai đoạn I: từ năm 2026 đến năm 2030 trên địa bàn tỉnh Quảng Ngãi (Nguồn vốn: Ngân sách trung ương và ngân sách tỉnh)</w:t>
+      </w:r>
+      <w:r>
+        <w:rPr>
+          <w:i/>
+          <w:color w:val="000000"/>
+        </w:rPr>
+        <w:t>;</w:t>
       </w:r>
     </w:p>
     <w:p>
@@ -730,15 +707,14 @@
         <w:spacing w:before="120" w:line="240" w:lineRule="auto"/>
         <w:ind w:firstLine="720"/>
       </w:pPr>
-      <w:ins w:id="1010" w:author="Bổ sung căn cứ (Claude)" w:date="2026-09-24T14:40:25Z">
-        <w:r>
-          <w:rPr>
-            <w:i/>
-            <w:color w:val="000000"/>
-          </w:rPr>
-          <w:t xml:space="preserve">Căn cứ Công văn số 10965/SNNMT-PTNT ngày 11/9/2026 của Sở Nông nghiệp và Môi trường về việc rà soát danh mục dự án đầu tư công trung hạn giai đoạn 2026 - 2030 thực hiện Chương trình mục tiêu quốc gia xây dựng nông thôn mới, giảm nghèo bền vững và phát triển kinh tế - xã hội vùng đồng bào dân tộc thiểu số và miền núi;</w:t>
-        </w:r>
-      </w:ins>
+      <w:r>
+        <w:rPr>
+          <w:i/>
+          <w:color w:val="000000"/>
+        </w:rPr>
+        <w:lastRenderedPageBreak/>
+        <w:t>Căn cứ Công văn số 10965/SNNMT-PTNT ngày 11/9/2026 của Sở Nông nghiệp và Môi trường về việc rà soát danh mục dự án đầu tư công trung hạn giai đoạn 2026 - 2030 thực hiện Chương trình mục tiêu quốc gia xây dựng nông thôn mới, giảm nghèo bền vững và phát triển kinh tế - xã hội vùng đồng bào dân tộc thiểu số và miền núi;</w:t>
+      </w:r>
     </w:p>
     <w:p>
       <w:pPr>
@@ -754,32 +730,7 @@
           <w:i/>
           <w:color w:val="000000"/>
         </w:rPr>
-        <w:t xml:space="preserve">Căn cứ Báo cáo số 326/BC-CĐKT </w:t>
-      </w:r>
-      <w:del w:id="1011" w:author="Điều chỉnh quy mô 24.894 triệu (Claude)" w:date="2026-09-24T14:40:25Z">
-        <w:r>
-          <w:rPr>
-            <w:i/>
-            <w:color w:val="000000"/>
-          </w:rPr>
-          <w:delText xml:space="preserve">ngày 09/7/2026</w:delText>
-        </w:r>
-      </w:del>
-      <w:ins w:id="1012" w:author="Điều chỉnh quy mô 24.894 triệu (Claude)" w:date="2026-09-24T14:40:25Z">
-        <w:r>
-          <w:rPr>
-            <w:i/>
-            <w:color w:val="000000"/>
-          </w:rPr>
-          <w:t xml:space="preserve">ngày 14/9/2026 (lần 2)</w:t>
-        </w:r>
-      </w:ins>
-      <w:r>
-        <w:rPr>
-          <w:i/>
-          <w:color w:val="000000"/>
-        </w:rPr>
-        <w:t xml:space="preserve"> của Trường Cao đẳng Kon Tum đề xuất mục tiêu, nhiệm vụ và nhu cầu kinh phí thực hiện Chương trình mục tiêu quốc gia giai đoạn 2026-2035, giai đoạn I từ năm 2026 đến năm 2030 và các phụ lục kèm theo;</w:t>
+        <w:t>Căn cứ Báo cáo số 326/BC-CĐKT ngày 14/9/2026 (lần 2) của Trường Cao đẳng Kon Tum đề xuất mục tiêu, nhiệm vụ và nhu cầu kinh phí thực hiện Chương trình mục tiêu quốc gia giai đoạn 2026-2035, giai đoạn I từ năm 2026 đến năm 2030 và các phụ lục kèm theo;</w:t>
       </w:r>
     </w:p>
     <w:p>
@@ -810,7 +761,6 @@
           <w:b/>
           <w:color w:val="000000"/>
         </w:rPr>
-        <w:lastRenderedPageBreak/>
         <w:t>QUYẾT ĐỊNH:</w:t>
       </w:r>
     </w:p>
@@ -836,29 +786,7 @@
         <w:rPr>
           <w:color w:val="000000"/>
         </w:rPr>
-        <w:t xml:space="preserve">Dự án “Đầu tư, cải tạo các công trình phục vụ người học, nhà giáo và mua sắm bổ sung thiết bị đáp ứng mục tiêu xây dựng Trường Cao đẳng Kon Tum trở thành trường cao đẳng </w:t>
-      </w:r>
-      <w:del w:id="1003" w:author="Điều chỉnh quy mô 24.894 triệu (Claude)" w:date="2026-09-24T14:40:25Z">
-        <w:r>
-          <w:rPr>
-            <w:color w:val="000000"/>
-          </w:rPr>
-          <w:delText xml:space="preserve">chất lượng cao giai đoạn 2026-2030”</w:delText>
-        </w:r>
-      </w:del>
-      <w:ins w:id="1004" w:author="Điều chỉnh quy mô 24.894 triệu (Claude)" w:date="2026-09-24T14:40:25Z">
-        <w:r>
-          <w:rPr>
-            <w:color w:val="000000"/>
-          </w:rPr>
-          <w:t xml:space="preserve">chất lượng cao giai đoạn 2026 - 2030”</w:t>
-        </w:r>
-      </w:ins>
-      <w:r>
-        <w:rPr>
-          <w:color w:val="000000"/>
-        </w:rPr>
-        <w:t xml:space="preserve"> </w:t>
+        <w:t xml:space="preserve">Dự án “Đầu tư, cải tạo các công trình phục vụ người học, nhà giáo và mua sắm bổ sung thiết bị đáp ứng mục tiêu xây dựng Trường Cao đẳng Kon Tum trở thành trường cao đẳng chất lượng cao giai đoạn 2026 - 2030” </w:t>
       </w:r>
       <w:r>
         <w:rPr>
@@ -883,29 +811,7 @@
         <w:rPr>
           <w:color w:val="000000"/>
         </w:rPr>
-        <w:t xml:space="preserve">“Đầu tư, cải tạo các công trình phục vụ người học, nhà giáo và mua sắm bổ sung thiết bị đáp ứng mục tiêu xây dựng Trường Cao đẳng Kon Tum trở thành trường cao đẳng </w:t>
-      </w:r>
-      <w:del w:id="1005" w:author="Điều chỉnh quy mô 24.894 triệu (Claude)" w:date="2026-09-24T14:40:25Z">
-        <w:r>
-          <w:rPr>
-            <w:color w:val="000000"/>
-          </w:rPr>
-          <w:delText xml:space="preserve">chất lượng cao giai đoạn 2026-2030”</w:delText>
-        </w:r>
-      </w:del>
-      <w:ins w:id="1006" w:author="Điều chỉnh quy mô 24.894 triệu (Claude)" w:date="2026-09-24T14:40:25Z">
-        <w:r>
-          <w:rPr>
-            <w:color w:val="000000"/>
-          </w:rPr>
-          <w:t xml:space="preserve">chất lượng cao giai đoạn 2026 - 2030”</w:t>
-        </w:r>
-      </w:ins>
-      <w:r>
-        <w:rPr>
-          <w:color w:val="000000"/>
-        </w:rPr>
-        <w:t xml:space="preserve">.</w:t>
+        <w:t>“Đầu tư, cải tạo các công trình phục vụ người học, nhà giáo và mua sắm bổ sung thiết bị đáp ứng mục tiêu xây dựng Trường Cao đẳng Kon Tum trở thành trường cao đẳng chất lượng cao giai đoạn 2026 - 2030”.</w:t>
       </w:r>
     </w:p>
     <w:p>
@@ -970,27 +876,11 @@
         </w:rPr>
         <w:t xml:space="preserve">4. Mục tiêu đầu tư: </w:t>
       </w:r>
-      <w:del w:id="1013" w:author="Điều chỉnh quy mô 24.894 triệu (Claude)" w:date="2026-09-24T14:40:25Z">
-        <w:r>
-          <w:rPr>
-            <w:color w:val="000000"/>
-          </w:rPr>
-          <w:delText xml:space="preserve">Cải thiện đồng bộ điều kiện học tập, thực hành, sinh hoạt và làm việc của người học, nhà giáo; bổ sung thiết bị đào tạo theo tiêu chuẩn, định mức; nâng cao năng lực đào tạo, quản trị và bảo đảm chất lượng, góp phần đáp ứng</w:delText>
-        </w:r>
-      </w:del>
-      <w:ins w:id="1014" w:author="Điều chỉnh quy mô 24.894 triệu (Claude)" w:date="2026-09-24T14:40:25Z">
-        <w:r>
-          <w:rPr>
-            <w:color w:val="000000"/>
-          </w:rPr>
-          <w:t xml:space="preserve">Sửa chữa một số hạng mục công trình phục vụ nhu cầu ăn ở, sinh hoạt của người học; mua sắm bổ sung một số thiết bị đào tạo theo tiêu chuẩn, định mức nhằm khắc phục khó khăn, nâng cao chất lượng hoạt động giáo dục nghề nghiệp của Trường, góp phần đáp ứng</w:t>
-        </w:r>
-      </w:ins>
       <w:r>
         <w:rPr>
           <w:color w:val="000000"/>
         </w:rPr>
-        <w:t xml:space="preserve"> mục tiêu xây dựng Trường Cao đẳng Kon Tum trở thành trường cao đẳng chất lượng cao giai đoạn 2026-2030.</w:t>
+        <w:t>Sửa chữa một số hạng mục công trình phục vụ nhu cầu ăn ở, sinh hoạt của người học; mua sắm bổ sung một số thiết bị đào tạo theo tiêu chuẩn, định mức nhằm khắc phục khó khăn, nâng cao chất lượng hoạt động giáo dục nghề nghiệp của Trường, góp phần đáp ứng mục tiêu xây dựng Trường Cao đẳng Kon Tum trở thành trường cao đẳng chất lượng cao giai đoạn 2026-2030.</w:t>
       </w:r>
     </w:p>
     <w:p>
@@ -1005,49 +895,11 @@
         </w:rPr>
         <w:t xml:space="preserve">5. Quy mô dự kiến: </w:t>
       </w:r>
-      <w:del w:id="1015" w:author="Điều chỉnh quy mô 24.894 triệu (Claude)" w:date="2026-09-24T14:40:25Z">
-        <w:r>
-          <w:rPr>
-            <w:color w:val="000000"/>
-          </w:rPr>
-          <w:delText xml:space="preserve">Đầu tư, nâng cấp, cải tạo, sửa chữa các công trình phục vụ người học và nhà giáo; mua sắm thiết bị đào tạo cho các trình độ cao đẳng, trung cấp, sơ cấp và chương trình đào tạo dưới 3 tháng.</w:delText>
-        </w:r>
-      </w:del>
-      <w:ins w:id="1016" w:author="Điều chỉnh quy mô 24.894 triệu (Claude)" w:date="2026-09-24T14:40:25Z">
-        <w:r>
-          <w:rPr>
-            <w:color w:val="000000"/>
-          </w:rPr>
-          <w:t xml:space="preserve">Sửa chữa, cải tạo 03 khu ký túc xá phục vụ người học (ký túc xá G và ký túc xá H, mỗi khu khoảng 2.640 m2 tại Trụ sở chính; ký túc xá khoảng 2.400 m2 tại cơ sở Khoa Kỹ thuật - Công nghệ và Đào tạo - Sát hạch lái xe); mua sắm bổ sung 02 mô hình (thiết bị) xe ô tô con số tự động phục vụ đào tạo thực hành ngành, nghề Công nghệ ô tô trình độ cao đẳng, trung cấp.</w:t>
-        </w:r>
-      </w:ins>
       <w:r>
         <w:rPr>
           <w:color w:val="000000"/>
         </w:rPr>
-        <w:t xml:space="preserve"> Danh mục, khối lượng, tiêu chuẩn kỹ thuật và cơ cấu chi phí được xác định trong </w:t>
-      </w:r>
-      <w:del w:id="1025" w:author="Đổi sang Báo cáo kinh tế - kỹ thuật (Claude)" w:date="2026-09-24T14:40:25Z">
-        <w:r>
-          <w:rPr>
-            <w:color w:val="000000"/>
-          </w:rPr>
-          <w:delText xml:space="preserve">hồ sơ Báo cáo nghiên cứu khả thi và dự toán</w:delText>
-        </w:r>
-      </w:del>
-      <w:ins w:id="1026" w:author="Đổi sang Báo cáo kinh tế - kỹ thuật (Claude)" w:date="2026-09-24T14:40:25Z">
-        <w:r>
-          <w:rPr>
-            <w:color w:val="000000"/>
-          </w:rPr>
-          <w:t xml:space="preserve">hồ sơ Báo cáo kinh tế - kỹ thuật và dự toán</w:t>
-        </w:r>
-      </w:ins>
-      <w:r>
-        <w:rPr>
-          <w:color w:val="000000"/>
-        </w:rPr>
-        <w:t xml:space="preserve"> được thẩm định.</w:t>
+        <w:t>Sửa chữa, cải tạo 03 khu ký túc xá phục vụ người học (ký túc xá G và ký túc xá H, mỗi khu khoảng 2.640 m2 tại Trụ sở chính; ký túc xá khoảng 2.400 m2 tại cơ sở Khoa Kỹ thuật - Công nghệ và Đào tạo - Sát hạch lái xe); mua sắm bổ sung 02 mô hình (thiết bị) xe ô tô con số tự động phục vụ đào tạo thực hành ngành, nghề Công nghệ ô tô trình độ cao đẳng, trung cấp. Danh mục, khối lượng, tiêu chuẩn kỹ thuật và cơ cấu chi phí được xác định trong hồ sơ Báo cáo kinh tế - kỹ thuật và dự toán được thẩm định.</w:t>
       </w:r>
     </w:p>
     <w:p>
@@ -1062,24 +914,13 @@
         </w:rPr>
         <w:t>6. Sơ bộ tổng mức đầu tư dự kiến của dự án</w:t>
       </w:r>
-      <w:del w:id="1017" w:author="Điều chỉnh quy mô 24.894 triệu (Claude)" w:date="2026-09-24T14:40:25Z">
-        <w:r>
-          <w:rPr>
-            <w:bCs/>
-            <w:color w:val="000000"/>
-          </w:rPr>
-          <w:delText>: 238.357.000.000 đồng</w:delText>
-        </w:r>
-      </w:del>
-      <w:ins w:id="1018" w:author="Điều chỉnh quy mô 24.894 triệu (Claude)" w:date="2026-09-24T14:40:25Z">
-        <w:r>
-          <w:rPr>
-            <w:bCs/>
-            <w:color w:val="000000"/>
-          </w:rPr>
-          <w:t xml:space="preserve">: 24.894.000.000 đồng</w:t>
-        </w:r>
-      </w:ins>
+      <w:r>
+        <w:rPr>
+          <w:bCs/>
+          <w:color w:val="000000"/>
+        </w:rPr>
+        <w:t>: 24.894.000.000 đồng</w:t>
+      </w:r>
       <w:r>
         <w:rPr>
           <w:color w:val="000000"/>
@@ -1102,66 +943,33 @@
         </w:rPr>
         <w:t xml:space="preserve">bằng chữ: </w:t>
       </w:r>
-      <w:del w:id="1019" w:author="Điều chỉnh quy mô 24.894 triệu (Claude)" w:date="2026-09-24T14:40:25Z">
-        <w:r>
-          <w:rPr>
-            <w:i/>
-            <w:iCs/>
-            <w:color w:val="000000"/>
-          </w:rPr>
-          <w:delText>Hai trăm ba mươi tám tỷ ba trăm năm mươi bảy triệu đồng).</w:delText>
-        </w:r>
-      </w:del>
-      <w:ins w:id="1020" w:author="Điều chỉnh quy mô 24.894 triệu (Claude)" w:date="2026-09-24T14:40:25Z">
-        <w:r>
-          <w:rPr>
-            <w:i/>
-            <w:iCs/>
-            <w:color w:val="000000"/>
-          </w:rPr>
-          <w:t xml:space="preserve">Hai mươi bốn tỷ tám trăm chín mươi bốn triệu đồng). Dự án thuộc nhóm C theo quy định tại khoản 4 Điều 11 của Luật Đầu tư công.</w:t>
-        </w:r>
-      </w:ins>
+      <w:r>
+        <w:rPr>
+          <w:i/>
+          <w:iCs/>
+          <w:color w:val="000000"/>
+        </w:rPr>
+        <w:t>Hai mươi bốn tỷ tám trăm chín mươi bốn triệu đồng). Dự án thuộc nhóm C theo quy định tại khoản 4 Điều 11 của Luật Đầu tư công.</w:t>
+      </w:r>
     </w:p>
     <w:p>
       <w:pPr>
         <w:spacing w:before="120" w:line="240" w:lineRule="auto"/>
         <w:ind w:firstLine="720"/>
       </w:pPr>
-      <w:del w:id="1021" w:author="Điều chỉnh quy mô 24.894 triệu (Claude)" w:date="2026-09-24T14:40:25Z">
-        <w:r>
-          <w:rPr>
-            <w:b/>
-            <w:color w:val="000000"/>
-          </w:rPr>
-          <w:delText xml:space="preserve">7. Cơ cấu nguồn vốn dự kiến của dự án theo Báo cáo số 326/BC-CĐKT: </w:delText>
-        </w:r>
-      </w:del>
-      <w:ins w:id="1022" w:author="Điều chỉnh quy mô 24.894 triệu (Claude)" w:date="2026-09-24T14:40:25Z">
-        <w:r>
-          <w:rPr>
-            <w:b/>
-            <w:color w:val="000000"/>
-          </w:rPr>
-          <w:t xml:space="preserve">7. Nguồn vốn dự kiến của dự án theo Báo cáo số 326/BC-CĐKT ngày 14/9/2026 (lần 2): </w:t>
-        </w:r>
-      </w:ins>
-      <w:del w:id="1023" w:author="Điều chỉnh quy mô 24.894 triệu (Claude)" w:date="2026-09-24T14:40:25Z">
-        <w:r>
-          <w:rPr>
-            <w:color w:val="000000"/>
-          </w:rPr>
-          <w:delText>Ngân sách trung ương 214.521.300.000 đồng; ngân sách địa phương 23.835.700.000 đồng</w:delText>
-        </w:r>
-      </w:del>
-      <w:ins w:id="1024" w:author="Điều chỉnh quy mô 24.894 triệu (Claude)" w:date="2026-09-24T14:40:25Z">
-        <w:r>
-          <w:rPr>
-            <w:color w:val="000000"/>
-          </w:rPr>
-          <w:t xml:space="preserve">Vốn đầu tư thuộc Chương trình; cơ cấu ngân sách trung ương và ngân sách địa phương được xác định theo kế hoạch vốn do cấp có thẩm quyền giao</w:t>
-        </w:r>
-      </w:ins>
+      <w:r>
+        <w:rPr>
+          <w:b/>
+          <w:color w:val="000000"/>
+        </w:rPr>
+        <w:t xml:space="preserve">7. Nguồn vốn dự kiến của dự án theo Báo cáo số 326/BC-CĐKT ngày 14/9/2026 (lần 2): </w:t>
+      </w:r>
+      <w:r>
+        <w:rPr>
+          <w:color w:val="000000"/>
+        </w:rPr>
+        <w:t>Vốn đầu tư thuộc Chương trình; cơ cấu ngân sách trung ương và ngân sách địa phương được xác định theo kế hoạch vốn do cấp có thẩm quyền giao</w:t>
+      </w:r>
       <w:r>
         <w:rPr>
           <w:color w:val="000000"/>
@@ -1216,29 +1024,7 @@
         <w:rPr>
           <w:color w:val="000000"/>
         </w:rPr>
-        <w:t xml:space="preserve">Rà soát hồ sơ pháp lý, quy hoạch, đất đai và tài sản; khảo sát, đánh giá hiện trạng; xác định phạm vi, quy mô đầu tư; </w:t>
-      </w:r>
-      <w:del w:id="1027" w:author="Đổi sang Báo cáo kinh tế - kỹ thuật (Claude)" w:date="2026-09-24T14:40:25Z">
-        <w:r>
-          <w:rPr>
-            <w:color w:val="000000"/>
-          </w:rPr>
-          <w:delText xml:space="preserve">lập Báo cáo nghiên cứu khả thi và thiết kế cơ sở;</w:delText>
-        </w:r>
-      </w:del>
-      <w:ins w:id="1028" w:author="Đổi sang Báo cáo kinh tế - kỹ thuật (Claude)" w:date="2026-09-24T14:40:25Z">
-        <w:r>
-          <w:rPr>
-            <w:color w:val="000000"/>
-          </w:rPr>
-          <w:t xml:space="preserve">lập Báo cáo kinh tế - kỹ thuật, gồm thiết kế bản vẽ thi công;</w:t>
-        </w:r>
-      </w:ins>
-      <w:r>
-        <w:rPr>
-          <w:color w:val="000000"/>
-        </w:rPr>
-        <w:t xml:space="preserve"> xây dựng danh mục, yêu cầu kỹ thuật và dự toán thiết bị; xác định tổng mức đầu tư, phương án nguồn vốn; thực hiện các thủ tục về môi trường, phòng cháy, chữa cháy và chuyên ngành khác theo quy định; tổ chức thẩm tra, thẩm định và hoàn thiện hồ sơ trình cấp có thẩm quyền quyết định đầu tư. Chi tiết tại Phụ lục kèm theo.</w:t>
+        <w:t>Rà soát hồ sơ pháp lý, quy hoạch, đất đai và tài sản; khảo sát, đánh giá hiện trạng; xác định phạm vi, quy mô đầu tư; lập Báo cáo kinh tế - kỹ thuật, gồm thiết kế bản vẽ thi công; xây dựng danh mục, yêu cầu kỹ thuật và dự toán thiết bị; xác định tổng mức đầu tư, phương án nguồn vốn; thực hiện các thủ tục về môi trường, phòng cháy, chữa cháy và chuyên ngành khác theo quy định; tổ chức thẩm tra, thẩm định và hoàn thiện hồ sơ trình cấp có thẩm quyền quyết định đầu tư. Chi tiết tại Phụ lục kèm theo.</w:t>
       </w:r>
     </w:p>
     <w:p>
@@ -1279,16 +1065,9 @@
         </w:rPr>
         <w:t>:</w:t>
       </w:r>
-      <w:del w:id="1037" w:author="Dự toán CBĐT tính lại theo quy mô (Claude)" w:date="2026-09-24T14:40:25Z">
-        <w:r>
-          <w:delText xml:space="preserve"> 6.249.856.462 đồng. </w:delText>
-        </w:r>
-      </w:del>
-      <w:ins w:id="1038" w:author="Dự toán CBĐT tính lại theo quy mô (Claude)" w:date="2026-09-24T14:40:25Z">
-        <w:r>
-          <w:t xml:space="preserve"> 1.530.224.522 đồng. </w:t>
-        </w:r>
-      </w:ins>
+      <w:r>
+        <w:t xml:space="preserve"> 1.530.224.522 đồng. </w:t>
+      </w:r>
       <w:r>
         <w:t>Chi tiết tại Phụ lục kèm theo. Giá trị chỉ được điền sau khi có dự toán chi tiết và kết quả thẩm định theo Điều 11 Nghị định số 206/2026/NĐ-CP.</w:t>
       </w:r>
@@ -1399,7 +1178,25 @@
         <w:rPr>
           <w:color w:val="000000"/>
         </w:rPr>
-        <w:t>Quyết định này có hiệu lực thi hành kể từ ngày ký.</w:t>
+        <w:t>Quyết định này có hiệu lực thi hành kể từ ngày ký</w:t>
+      </w:r>
+      <w:r>
+        <w:rPr>
+          <w:color w:val="000000"/>
+        </w:rPr>
+        <w:t xml:space="preserve"> và thay thế Quyết định số 1899/QĐ-CĐKT ngày 28/8/2026 của Hiệu trưởng Trường Cao đẳng Kon Tum </w:t>
+      </w:r>
+      <w:r>
+        <w:rPr>
+          <w:color w:val="000000"/>
+        </w:rPr>
+        <w:t>phê duyệt nhiệm vụ và dự toán kinh phí chuẩn bị đầu tư Dự án “Đầu tư, cải tạo các công trình phục vụ người học, nhà giáo và mua sắm bổ sung thiết bị đáp ứng mục tiêu xây dựng Trường Cao đẳng Kon Tum trở thành trường cao đẳng chất lượng cao giai đoạn 2026 - 2030”</w:t>
+      </w:r>
+      <w:r>
+        <w:rPr>
+          <w:color w:val="000000"/>
+        </w:rPr>
+        <w:t>.</w:t>
       </w:r>
     </w:p>
     <w:p>
@@ -1668,28 +1465,8 @@
           <w:color w:val="000000"/>
           <w:sz w:val="26"/>
         </w:rPr>
-        <w:t xml:space="preserve">ĐẦU TƯ, CẢI TẠO CÁC CÔNG TRÌNH PHỤC VỤ NGƯỜI HỌC, NHÀ GIÁO VÀ MUA SẮM BỔ SUNG THIẾT BỊ ĐÁP ỨNG MỤC TIÊU XÂY DỰNG TRƯỜNG CAO ĐẲNG KON TUM TRỞ THÀNH TRƯỜNG CAO ĐẲNG CHẤT LƯỢNG CAO </w:t>
+        <w:t>ĐẦU TƯ, CẢI TẠO CÁC CÔNG TRÌNH PHỤC VỤ NGƯỜI HỌC, NHÀ GIÁO VÀ MUA SẮM BỔ SUNG THIẾT BỊ ĐÁP ỨNG MỤC TIÊU XÂY DỰNG TRƯỜNG CAO ĐẲNG KON TUM TRỞ THÀNH TRƯỜNG CAO ĐẲNG CHẤT LƯỢNG CAO GIAI ĐOẠN 2026 - 2030</w:t>
       </w:r>
-      <w:del w:id="1007" w:author="Điều chỉnh quy mô 24.894 triệu (Claude)" w:date="2026-09-24T14:40:25Z">
-        <w:r>
-          <w:rPr>
-            <w:b/>
-            <w:color w:val="000000"/>
-            <w:sz w:val="26"/>
-          </w:rPr>
-          <w:delText xml:space="preserve">GIAI ĐOẠN 2026-2030</w:delText>
-        </w:r>
-      </w:del>
-      <w:ins w:id="1008" w:author="Điều chỉnh quy mô 24.894 triệu (Claude)" w:date="2026-09-24T14:40:25Z">
-        <w:r>
-          <w:rPr>
-            <w:b/>
-            <w:color w:val="000000"/>
-            <w:sz w:val="26"/>
-          </w:rPr>
-          <w:t xml:space="preserve">GIAI ĐOẠN 2026 - 2030</w:t>
-        </w:r>
-      </w:ins>
     </w:p>
     <w:p>
       <w:pPr>
@@ -2504,24 +2281,13 @@
                 <w:szCs w:val="28"/>
               </w:rPr>
             </w:pPr>
-            <w:del w:id="1029" w:author="Đổi sang Báo cáo kinh tế - kỹ thuật (Claude)" w:date="2026-09-24T14:40:25Z">
-              <w:r>
-                <w:rPr>
-                  <w:color w:val="000000"/>
-                  <w:szCs w:val="28"/>
-                </w:rPr>
-                <w:delText>Lập Báo cáo nghiên cứu khả thi và thiết kế cơ sở</w:delText>
-              </w:r>
-            </w:del>
-            <w:ins w:id="1030" w:author="Đổi sang Báo cáo kinh tế - kỹ thuật (Claude)" w:date="2026-09-24T14:40:25Z">
-              <w:r>
-                <w:rPr>
-                  <w:color w:val="000000"/>
-                  <w:szCs w:val="28"/>
-                </w:rPr>
-                <w:t xml:space="preserve">Lập Báo cáo kinh tế - kỹ thuật và thiết kế bản vẽ thi công</w:t>
-              </w:r>
-            </w:ins>
+            <w:r>
+              <w:rPr>
+                <w:color w:val="000000"/>
+                <w:szCs w:val="28"/>
+              </w:rPr>
+              <w:t>Lập Báo cáo kinh tế - kỹ thuật và thiết kế bản vẽ thi công</w:t>
+            </w:r>
           </w:p>
         </w:tc>
         <w:tc>
@@ -2543,24 +2309,13 @@
                 <w:szCs w:val="28"/>
               </w:rPr>
             </w:pPr>
-            <w:del w:id="1031" w:author="Đổi sang Báo cáo kinh tế - kỹ thuật (Claude)" w:date="2026-09-24T14:40:25Z">
-              <w:r>
-                <w:rPr>
-                  <w:color w:val="000000"/>
-                  <w:szCs w:val="28"/>
-                </w:rPr>
-                <w:delText>Báo cáo nghiên cứu khả thi; hồ sơ thiết kế cơ sở; thuyết minh giải pháp</w:delText>
-              </w:r>
-            </w:del>
-            <w:ins w:id="1032" w:author="Đổi sang Báo cáo kinh tế - kỹ thuật (Claude)" w:date="2026-09-24T14:40:25Z">
-              <w:r>
-                <w:rPr>
-                  <w:color w:val="000000"/>
-                  <w:szCs w:val="28"/>
-                </w:rPr>
-                <w:t xml:space="preserve">Báo cáo kinh tế - kỹ thuật; hồ sơ thiết kế bản vẽ thi công; thuyết minh giải pháp</w:t>
-              </w:r>
-            </w:ins>
+            <w:r>
+              <w:rPr>
+                <w:color w:val="000000"/>
+                <w:szCs w:val="28"/>
+              </w:rPr>
+              <w:t>Báo cáo kinh tế - kỹ thuật; hồ sơ thiết kế bản vẽ thi công; thuyết minh giải pháp</w:t>
+            </w:r>
           </w:p>
         </w:tc>
         <w:tc>
@@ -3496,7 +3251,7 @@
                 <w:color w:val="000000"/>
                 <w:szCs w:val="28"/>
               </w:rPr>
-              <w:t>Tình trạng hồ sơ</w:t>
+              <w:t>Ghi chú</w:t>
             </w:r>
           </w:p>
         </w:tc>
@@ -3586,24 +3341,13 @@
                 <w:szCs w:val="28"/>
               </w:rPr>
             </w:pPr>
-            <w:del w:id="1039" w:author="Dự toán CBĐT tính lại theo quy mô (Claude)" w:date="2026-09-24T14:40:25Z">
-              <w:r>
-                <w:rPr>
-                  <w:color w:val="000000"/>
-                  <w:szCs w:val="28"/>
-                </w:rPr>
-                <w:delText>4.137.372.520</w:delText>
-              </w:r>
-            </w:del>
-            <w:ins w:id="1040" w:author="Dự toán CBĐT tính lại theo quy mô (Claude)" w:date="2026-09-24T14:40:25Z">
-              <w:r>
-                <w:rPr>
-                  <w:color w:val="000000"/>
-                  <w:szCs w:val="28"/>
-                </w:rPr>
-                <w:t xml:space="preserve">667.433.022</w:t>
-              </w:r>
-            </w:ins>
+            <w:r>
+              <w:rPr>
+                <w:color w:val="000000"/>
+                <w:szCs w:val="28"/>
+              </w:rPr>
+              <w:t>667.433.022</w:t>
+            </w:r>
           </w:p>
         </w:tc>
         <w:tc>
@@ -3682,24 +3426,13 @@
                 <w:szCs w:val="28"/>
               </w:rPr>
             </w:pPr>
-            <w:del w:id="1033" w:author="Đổi sang Báo cáo kinh tế - kỹ thuật (Claude)" w:date="2026-09-24T14:40:25Z">
-              <w:r>
-                <w:rPr>
-                  <w:color w:val="000000"/>
-                  <w:szCs w:val="28"/>
-                </w:rPr>
-                <w:delText>Khảo sát xây dựng phục vụ lập Báo cáo nghiên cứu khả thi</w:delText>
-              </w:r>
-            </w:del>
-            <w:ins w:id="1034" w:author="Đổi sang Báo cáo kinh tế - kỹ thuật (Claude)" w:date="2026-09-24T14:40:25Z">
-              <w:r>
-                <w:rPr>
-                  <w:color w:val="000000"/>
-                  <w:szCs w:val="28"/>
-                </w:rPr>
-                <w:t xml:space="preserve">Khảo sát xây dựng phục vụ lập Báo cáo kinh tế - kỹ thuật</w:t>
-              </w:r>
-            </w:ins>
+            <w:r>
+              <w:rPr>
+                <w:color w:val="000000"/>
+                <w:szCs w:val="28"/>
+              </w:rPr>
+              <w:t>Khảo sát xây dựng phục vụ lập Báo cáo kinh tế - kỹ thuật</w:t>
+            </w:r>
           </w:p>
         </w:tc>
         <w:tc>
@@ -3722,24 +3455,13 @@
                 <w:szCs w:val="28"/>
               </w:rPr>
             </w:pPr>
-            <w:del w:id="1041" w:author="Dự toán CBĐT tính lại theo quy mô (Claude)" w:date="2026-09-24T14:40:25Z">
-              <w:r>
-                <w:rPr>
-                  <w:color w:val="000000"/>
-                  <w:szCs w:val="28"/>
-                </w:rPr>
-                <w:delText>900.000.000</w:delText>
-              </w:r>
-            </w:del>
-            <w:ins w:id="1042" w:author="Dự toán CBĐT tính lại theo quy mô (Claude)" w:date="2026-09-24T14:40:25Z">
-              <w:r>
-                <w:rPr>
-                  <w:color w:val="000000"/>
-                  <w:szCs w:val="28"/>
-                </w:rPr>
-                <w:t xml:space="preserve">93.995.981</w:t>
-              </w:r>
-            </w:ins>
+            <w:r>
+              <w:rPr>
+                <w:color w:val="000000"/>
+                <w:szCs w:val="28"/>
+              </w:rPr>
+              <w:t>93.995.981</w:t>
+            </w:r>
           </w:p>
         </w:tc>
         <w:tc>
@@ -3818,24 +3540,13 @@
                 <w:szCs w:val="28"/>
               </w:rPr>
             </w:pPr>
-            <w:del w:id="1035" w:author="Đổi sang Báo cáo kinh tế - kỹ thuật (Claude)" w:date="2026-09-24T14:40:25Z">
-              <w:r>
-                <w:rPr>
-                  <w:color w:val="000000"/>
-                  <w:szCs w:val="28"/>
-                </w:rPr>
-                <w:delText>Lập Báo cáo nghiên cứu khả thi</w:delText>
-              </w:r>
-            </w:del>
-            <w:ins w:id="1036" w:author="Đổi sang Báo cáo kinh tế - kỹ thuật (Claude)" w:date="2026-09-24T14:40:25Z">
-              <w:r>
-                <w:rPr>
-                  <w:color w:val="000000"/>
-                  <w:szCs w:val="28"/>
-                </w:rPr>
-                <w:t xml:space="preserve">Lập Báo cáo kinh tế - kỹ thuật</w:t>
-              </w:r>
-            </w:ins>
+            <w:r>
+              <w:rPr>
+                <w:color w:val="000000"/>
+                <w:szCs w:val="28"/>
+              </w:rPr>
+              <w:t>Lập Báo cáo kinh tế - kỹ thuật</w:t>
+            </w:r>
           </w:p>
         </w:tc>
         <w:tc>
@@ -3858,266 +3569,13 @@
                 <w:szCs w:val="28"/>
               </w:rPr>
             </w:pPr>
-            <w:del w:id="1043" w:author="Dự toán CBĐT tính lại theo quy mô (Claude)" w:date="2026-09-24T14:40:25Z">
-              <w:r>
-                <w:rPr>
-                  <w:color w:val="000000"/>
-                  <w:szCs w:val="28"/>
-                </w:rPr>
-                <w:delText>1.015.897.504</w:delText>
-              </w:r>
-            </w:del>
-            <w:ins w:id="1044" w:author="Dự toán CBĐT tính lại theo quy mô (Claude)" w:date="2026-09-24T14:40:25Z">
-              <w:r>
-                <w:rPr>
-                  <w:color w:val="000000"/>
-                  <w:szCs w:val="28"/>
-                </w:rPr>
-                <w:t xml:space="preserve">758.349.265</w:t>
-              </w:r>
-            </w:ins>
-          </w:p>
-        </w:tc>
-        <w:tc>
-          <w:tcPr>
-            <w:tcW w:w="1984" w:type="dxa"/>
-            <w:shd w:val="clear" w:color="auto" w:fill="auto"/>
-            <w:tcMar>
-              <w:top w:w="55" w:type="dxa"/>
-              <w:left w:w="80" w:type="dxa"/>
-              <w:bottom w:w="55" w:type="dxa"/>
-              <w:right w:w="80" w:type="dxa"/>
-            </w:tcMar>
-            <w:vAlign w:val="center"/>
-          </w:tcPr>
-          <w:p>
-            <w:pPr>
-              <w:spacing w:after="0" w:line="252" w:lineRule="auto"/>
-              <w:jc w:val="center"/>
-              <w:rPr>
-                <w:szCs w:val="28"/>
-              </w:rPr>
-            </w:pPr>
-          </w:p>
-        </w:tc>
-      </w:tr>
-      <w:tr>
-        <w:trPr>
-          <w:cantSplit/>
-          <w:del w:id="1045" w:author="Dự toán CBĐT tính lại theo quy mô (Claude)" w:date="2026-09-24T14:40:25Z"/>
-        </w:trPr>
-        <w:tc>
-          <w:tcPr>
-            <w:tcW w:w="566" w:type="dxa"/>
-            <w:shd w:val="clear" w:color="auto" w:fill="auto"/>
-            <w:tcMar>
-              <w:top w:w="55" w:type="dxa"/>
-              <w:left w:w="80" w:type="dxa"/>
-              <w:bottom w:w="55" w:type="dxa"/>
-              <w:right w:w="80" w:type="dxa"/>
-            </w:tcMar>
-            <w:vAlign w:val="center"/>
-          </w:tcPr>
-          <w:p>
-            <w:pPr>
-              <w:spacing w:after="0" w:line="252" w:lineRule="auto"/>
-              <w:jc w:val="center"/>
-              <w:rPr>
-                <w:szCs w:val="28"/>
-              </w:rPr>
-            </w:pPr>
-            <w:del w:id="1046" w:author="Dự toán CBĐT tính lại theo quy mô (Claude)" w:date="2026-09-24T14:40:25Z">
-              <w:r>
-                <w:rPr>
-                  <w:color w:val="000000"/>
-                  <w:szCs w:val="28"/>
-                </w:rPr>
-                <w:delText>4</w:delText>
-              </w:r>
-            </w:del>
-          </w:p>
-        </w:tc>
-        <w:tc>
-          <w:tcPr>
-            <w:tcW w:w="10004" w:type="dxa"/>
-            <w:shd w:val="clear" w:color="auto" w:fill="auto"/>
-            <w:tcMar>
-              <w:top w:w="55" w:type="dxa"/>
-              <w:left w:w="80" w:type="dxa"/>
-              <w:bottom w:w="55" w:type="dxa"/>
-              <w:right w:w="80" w:type="dxa"/>
-            </w:tcMar>
-            <w:vAlign w:val="center"/>
-          </w:tcPr>
-          <w:p>
-            <w:pPr>
-              <w:spacing w:after="0" w:line="252" w:lineRule="auto"/>
-              <w:jc w:val="left"/>
-              <w:rPr>
-                <w:szCs w:val="28"/>
-              </w:rPr>
-            </w:pPr>
-            <w:del w:id="1047" w:author="Dự toán CBĐT tính lại theo quy mô (Claude)" w:date="2026-09-24T14:40:25Z">
-              <w:r>
-                <w:rPr>
-                  <w:color w:val="000000"/>
-                  <w:szCs w:val="28"/>
-                </w:rPr>
-                <w:delText>Thẩm tra Báo cáo nghiên cứu khả thi</w:delText>
-              </w:r>
-            </w:del>
-          </w:p>
-        </w:tc>
-        <w:tc>
-          <w:tcPr>
-            <w:tcW w:w="2154" w:type="dxa"/>
-            <w:shd w:val="clear" w:color="auto" w:fill="auto"/>
-            <w:tcMar>
-              <w:top w:w="55" w:type="dxa"/>
-              <w:left w:w="80" w:type="dxa"/>
-              <w:bottom w:w="55" w:type="dxa"/>
-              <w:right w:w="80" w:type="dxa"/>
-            </w:tcMar>
-            <w:vAlign w:val="center"/>
-          </w:tcPr>
-          <w:p>
-            <w:pPr>
-              <w:spacing w:after="0" w:line="252" w:lineRule="auto"/>
-              <w:jc w:val="right"/>
-              <w:rPr>
-                <w:szCs w:val="28"/>
-              </w:rPr>
-            </w:pPr>
-            <w:del w:id="1048" w:author="Dự toán CBĐT tính lại theo quy mô (Claude)" w:date="2026-09-24T14:40:25Z">
-              <w:r>
-                <w:rPr>
-                  <w:color w:val="000000"/>
-                  <w:szCs w:val="28"/>
-                </w:rPr>
-                <w:delText>153.882.235</w:delText>
-              </w:r>
-            </w:del>
-          </w:p>
-        </w:tc>
-        <w:tc>
-          <w:tcPr>
-            <w:tcW w:w="1984" w:type="dxa"/>
-            <w:shd w:val="clear" w:color="auto" w:fill="auto"/>
-            <w:tcMar>
-              <w:top w:w="55" w:type="dxa"/>
-              <w:left w:w="80" w:type="dxa"/>
-              <w:bottom w:w="55" w:type="dxa"/>
-              <w:right w:w="80" w:type="dxa"/>
-            </w:tcMar>
-            <w:vAlign w:val="center"/>
-          </w:tcPr>
-          <w:p>
-            <w:pPr>
-              <w:spacing w:after="0" w:line="252" w:lineRule="auto"/>
-              <w:jc w:val="center"/>
-              <w:rPr>
-                <w:szCs w:val="28"/>
-              </w:rPr>
-            </w:pPr>
-          </w:p>
-        </w:tc>
-      </w:tr>
-      <w:tr>
-        <w:trPr>
-          <w:cantSplit/>
-          <w:del w:id="1049" w:author="Dự toán CBĐT tính lại theo quy mô (Claude)" w:date="2026-09-24T14:40:25Z"/>
-        </w:trPr>
-        <w:tc>
-          <w:tcPr>
-            <w:tcW w:w="566" w:type="dxa"/>
-            <w:shd w:val="clear" w:color="auto" w:fill="auto"/>
-            <w:tcMar>
-              <w:top w:w="55" w:type="dxa"/>
-              <w:left w:w="80" w:type="dxa"/>
-              <w:bottom w:w="55" w:type="dxa"/>
-              <w:right w:w="80" w:type="dxa"/>
-            </w:tcMar>
-            <w:vAlign w:val="center"/>
-          </w:tcPr>
-          <w:p>
-            <w:pPr>
-              <w:spacing w:after="0" w:line="252" w:lineRule="auto"/>
-              <w:jc w:val="center"/>
-              <w:rPr>
-                <w:szCs w:val="28"/>
-              </w:rPr>
-            </w:pPr>
-            <w:del w:id="1050" w:author="Dự toán CBĐT tính lại theo quy mô (Claude)" w:date="2026-09-24T14:40:25Z">
-              <w:r>
-                <w:rPr>
-                  <w:color w:val="000000"/>
-                  <w:szCs w:val="28"/>
-                </w:rPr>
-                <w:delText>5</w:delText>
-              </w:r>
-            </w:del>
-          </w:p>
-        </w:tc>
-        <w:tc>
-          <w:tcPr>
-            <w:tcW w:w="10004" w:type="dxa"/>
-            <w:shd w:val="clear" w:color="auto" w:fill="auto"/>
-            <w:tcMar>
-              <w:top w:w="55" w:type="dxa"/>
-              <w:left w:w="80" w:type="dxa"/>
-              <w:bottom w:w="55" w:type="dxa"/>
-              <w:right w:w="80" w:type="dxa"/>
-            </w:tcMar>
-            <w:vAlign w:val="center"/>
-          </w:tcPr>
-          <w:p>
-            <w:pPr>
-              <w:spacing w:after="0" w:line="252" w:lineRule="auto"/>
-              <w:jc w:val="left"/>
-              <w:rPr>
-                <w:szCs w:val="28"/>
-              </w:rPr>
-            </w:pPr>
-            <w:del w:id="1051" w:author="Dự toán CBĐT tính lại theo quy mô (Claude)" w:date="2026-09-24T14:40:25Z">
-              <w:r>
-                <w:rPr>
-                  <w:color w:val="000000"/>
-                  <w:szCs w:val="28"/>
-                </w:rPr>
-                <w:delText>Phí thẩm định dự án đầu tư xây dựng</w:delText>
-              </w:r>
-            </w:del>
-          </w:p>
-        </w:tc>
-        <w:tc>
-          <w:tcPr>
-            <w:tcW w:w="2154" w:type="dxa"/>
-            <w:shd w:val="clear" w:color="auto" w:fill="auto"/>
-            <w:tcMar>
-              <w:top w:w="55" w:type="dxa"/>
-              <w:left w:w="80" w:type="dxa"/>
-              <w:bottom w:w="55" w:type="dxa"/>
-              <w:right w:w="80" w:type="dxa"/>
-            </w:tcMar>
-            <w:vAlign w:val="center"/>
-          </w:tcPr>
-          <w:p>
-            <w:pPr>
-              <w:spacing w:after="0" w:line="252" w:lineRule="auto"/>
-              <w:jc w:val="right"/>
-              <w:rPr>
-                <w:szCs w:val="28"/>
-              </w:rPr>
-            </w:pPr>
-            <w:del w:id="1052" w:author="Dự toán CBĐT tính lại theo quy mô (Claude)" w:date="2026-09-24T14:40:25Z">
-              <w:r>
-                <w:rPr>
-                  <w:color w:val="000000"/>
-                  <w:szCs w:val="28"/>
-                </w:rPr>
-                <w:delText>11.536.906</w:delText>
-              </w:r>
-            </w:del>
+            <w:r>
+              <w:rPr>
+                <w:color w:val="000000"/>
+                <w:szCs w:val="28"/>
+              </w:rPr>
+              <w:t>758.349.265</w:t>
+            </w:r>
           </w:p>
         </w:tc>
         <w:tc>
@@ -4167,24 +3625,13 @@
                 <w:szCs w:val="28"/>
               </w:rPr>
             </w:pPr>
-            <w:del w:id="1053" w:author="Dự toán CBĐT tính lại theo quy mô (Claude)" w:date="2026-09-24T14:40:25Z">
-              <w:r>
-                <w:rPr>
-                  <w:color w:val="000000"/>
-                  <w:szCs w:val="28"/>
-                </w:rPr>
-                <w:delText>6</w:delText>
-              </w:r>
-            </w:del>
-            <w:ins w:id="1054" w:author="Dự toán CBĐT tính lại theo quy mô (Claude)" w:date="2026-09-24T14:40:25Z">
-              <w:r>
-                <w:rPr>
-                  <w:color w:val="000000"/>
-                  <w:szCs w:val="28"/>
-                </w:rPr>
-                <w:t xml:space="preserve">4</w:t>
-              </w:r>
-            </w:ins>
+            <w:r>
+              <w:rPr>
+                <w:color w:val="000000"/>
+                <w:szCs w:val="28"/>
+              </w:rPr>
+              <w:t>4</w:t>
+            </w:r>
           </w:p>
         </w:tc>
         <w:tc>
@@ -4236,24 +3683,13 @@
                 <w:szCs w:val="28"/>
               </w:rPr>
             </w:pPr>
-            <w:del w:id="1059" w:author="Dự toán CBĐT tính lại theo quy mô (Claude)" w:date="2026-09-24T14:40:25Z">
-              <w:r>
-                <w:rPr>
-                  <w:color w:val="000000"/>
-                  <w:szCs w:val="28"/>
-                </w:rPr>
-                <w:delText>22.892.551</w:delText>
-              </w:r>
-            </w:del>
-            <w:ins w:id="1060" w:author="Dự toán CBĐT tính lại theo quy mô (Claude)" w:date="2026-09-24T14:40:25Z">
-              <w:r>
-                <w:rPr>
-                  <w:color w:val="000000"/>
-                  <w:szCs w:val="28"/>
-                </w:rPr>
-                <w:t xml:space="preserve">5.446.254</w:t>
-              </w:r>
-            </w:ins>
+            <w:r>
+              <w:rPr>
+                <w:color w:val="000000"/>
+                <w:szCs w:val="28"/>
+              </w:rPr>
+              <w:t>5.446.254</w:t>
+            </w:r>
           </w:p>
         </w:tc>
         <w:tc>
@@ -4303,24 +3739,13 @@
                 <w:szCs w:val="28"/>
               </w:rPr>
             </w:pPr>
-            <w:del w:id="1055" w:author="Dự toán CBĐT tính lại theo quy mô (Claude)" w:date="2026-09-24T14:40:25Z">
-              <w:r>
-                <w:rPr>
-                  <w:color w:val="000000"/>
-                  <w:szCs w:val="28"/>
-                </w:rPr>
-                <w:delText>7</w:delText>
-              </w:r>
-            </w:del>
-            <w:ins w:id="1056" w:author="Dự toán CBĐT tính lại theo quy mô (Claude)" w:date="2026-09-24T14:40:25Z">
-              <w:r>
-                <w:rPr>
-                  <w:color w:val="000000"/>
-                  <w:szCs w:val="28"/>
-                </w:rPr>
-                <w:t xml:space="preserve">5</w:t>
-              </w:r>
-            </w:ins>
+            <w:r>
+              <w:rPr>
+                <w:color w:val="000000"/>
+                <w:szCs w:val="28"/>
+              </w:rPr>
+              <w:t>5</w:t>
+            </w:r>
           </w:p>
         </w:tc>
         <w:tc>
@@ -4372,24 +3797,13 @@
                 <w:szCs w:val="28"/>
               </w:rPr>
             </w:pPr>
-            <w:del w:id="1061" w:author="Dự toán CBĐT tính lại theo quy mô (Claude)" w:date="2026-09-24T14:40:25Z">
-              <w:r>
-                <w:rPr>
-                  <w:color w:val="000000"/>
-                  <w:szCs w:val="28"/>
-                </w:rPr>
-                <w:delText>4.137.373</w:delText>
-              </w:r>
-            </w:del>
-            <w:ins w:id="1062" w:author="Dự toán CBĐT tính lại theo quy mô (Claude)" w:date="2026-09-24T14:40:25Z">
-              <w:r>
-                <w:rPr>
-                  <w:color w:val="000000"/>
-                  <w:szCs w:val="28"/>
-                </w:rPr>
-                <w:t xml:space="preserve">2.000.000</w:t>
-              </w:r>
-            </w:ins>
+            <w:r>
+              <w:rPr>
+                <w:color w:val="000000"/>
+                <w:szCs w:val="28"/>
+              </w:rPr>
+              <w:t>2.000.000</w:t>
+            </w:r>
           </w:p>
         </w:tc>
         <w:tc>
@@ -4439,24 +3853,13 @@
                 <w:szCs w:val="28"/>
               </w:rPr>
             </w:pPr>
-            <w:del w:id="1057" w:author="Dự toán CBĐT tính lại theo quy mô (Claude)" w:date="2026-09-24T14:40:25Z">
-              <w:r>
-                <w:rPr>
-                  <w:color w:val="000000"/>
-                  <w:szCs w:val="28"/>
-                </w:rPr>
-                <w:delText>8</w:delText>
-              </w:r>
-            </w:del>
-            <w:ins w:id="1058" w:author="Dự toán CBĐT tính lại theo quy mô (Claude)" w:date="2026-09-24T14:40:25Z">
-              <w:r>
-                <w:rPr>
-                  <w:color w:val="000000"/>
-                  <w:szCs w:val="28"/>
-                </w:rPr>
-                <w:t xml:space="preserve">6</w:t>
-              </w:r>
-            </w:ins>
+            <w:r>
+              <w:rPr>
+                <w:color w:val="000000"/>
+                <w:szCs w:val="28"/>
+              </w:rPr>
+              <w:t>6</w:t>
+            </w:r>
           </w:p>
         </w:tc>
         <w:tc>
@@ -4508,24 +3911,13 @@
                 <w:szCs w:val="28"/>
               </w:rPr>
             </w:pPr>
-            <w:del w:id="1063" w:author="Dự toán CBĐT tính lại theo quy mô (Claude)" w:date="2026-09-24T14:40:25Z">
-              <w:r>
-                <w:rPr>
-                  <w:color w:val="000000"/>
-                  <w:szCs w:val="28"/>
-                </w:rPr>
-                <w:delText>4.137.373</w:delText>
-              </w:r>
-            </w:del>
-            <w:ins w:id="1064" w:author="Dự toán CBĐT tính lại theo quy mô (Claude)" w:date="2026-09-24T14:40:25Z">
-              <w:r>
-                <w:rPr>
-                  <w:color w:val="000000"/>
-                  <w:szCs w:val="28"/>
-                </w:rPr>
-                <w:t xml:space="preserve">3.000.000</w:t>
-              </w:r>
-            </w:ins>
+            <w:r>
+              <w:rPr>
+                <w:color w:val="000000"/>
+                <w:szCs w:val="28"/>
+              </w:rPr>
+              <w:t>3.000.000</w:t>
+            </w:r>
           </w:p>
         </w:tc>
         <w:tc>
@@ -4626,28 +4018,15 @@
                 <w:szCs w:val="28"/>
               </w:rPr>
             </w:pPr>
-            <w:del w:id="1065" w:author="Dự toán CBĐT tính lại theo quy mô (Claude)" w:date="2026-09-24T14:40:25Z">
-              <w:r>
-                <w:rPr>
-                  <w:b/>
-                  <w:bCs/>
-                  <w:color w:val="000000"/>
-                  <w:szCs w:val="28"/>
-                </w:rPr>
-                <w:delText>6.249.856.462</w:delText>
-              </w:r>
-            </w:del>
-            <w:ins w:id="1066" w:author="Dự toán CBĐT tính lại theo quy mô (Claude)" w:date="2026-09-24T14:40:25Z">
-              <w:r>
-                <w:rPr>
-                  <w:b/>
-                  <w:bCs/>
-                  <w:color w:val="000000"/>
-                  <w:szCs w:val="28"/>
-                </w:rPr>
-                <w:t xml:space="preserve">1.530.224.522</w:t>
-              </w:r>
-            </w:ins>
+            <w:r>
+              <w:rPr>
+                <w:b/>
+                <w:bCs/>
+                <w:color w:val="000000"/>
+                <w:szCs w:val="28"/>
+              </w:rPr>
+              <w:t>1.530.224.522</w:t>
+            </w:r>
           </w:p>
         </w:tc>
         <w:tc>
@@ -4676,9 +4055,20 @@
     </w:tbl>
     <w:p>
       <w:pPr>
-        <w:shd w:val="clear" w:color="auto" w:fill="E7E6E6"/>
-        <w:spacing w:line="264" w:lineRule="auto"/>
+        <w:spacing w:after="0" w:line="252" w:lineRule="auto"/>
+        <w:jc w:val="center"/>
+        <w:rPr>
+          <w:color w:val="000000"/>
+          <w:szCs w:val="28"/>
+        </w:rPr>
       </w:pPr>
+      <w:r>
+        <w:rPr>
+          <w:color w:val="000000"/>
+          <w:szCs w:val="28"/>
+        </w:rPr>
+        <w:t>Bằng chữ: Một tỷ, năm trăm ba mươi triệu, hai trăm hai mươi bốn ngàn, năm trăm hai mươi hai đồng.</w:t>
+      </w:r>
     </w:p>
     <w:sectPr>
       <w:headerReference w:type="default" r:id="rId10"/>

</xml_diff>